<commit_message>
Drop the three proposed systems; Splunk and Nessus are domain-joined Linux
Per review: no SBD-NPS01, SBD-SENSOR01, or SBD-ADMIN-AUD01. 802.1X and
the network-sensor lessons are removed; audit custody stays a separate role
on SBD-ADMIN-SRV01; network monitoring uses the router deny log in Splunk.
Room layout and equipment are back to main.

Splunk and Nessus run on Linux and are domain-joined: they join F02/F03/F18,
send syslog over TLS (F07), and patch from SBD-REPO01 (new F19). The
single-instance risk acceptance records the reason: a small network with
modest resource needs. Courses 1.8 and 1.10 provision them on Linux; the
1.8 scan quiz uses the distribution's STIG. Lesson counts, workbooks,
checklists, and generated files rebuilt.

Co-Authored-By: Claude Opus 5.5 <noreply@anthropic.com>
Claude-Session: https://claude.ai/code/session_019wopQQuPwG5CcFGYaGF73Y
</commit_message>
<xml_diff>
--- a/public/training/connect-segment/SecureByDesign-connect-segment-Workbook.docx
+++ b/public/training/connect-segment/SecureByDesign-connect-segment-Workbook.docx
@@ -1765,7 +1765,7 @@
       <w:pPr>
         <w:spacing w:after="60" w:before="0" w:line="288" w:lineRule="auto"/>
       </w:pPr>
-      <w:hyperlink w:history="1" r:id="rIdxo3die2zx6mt1jcqfec9n">
+      <w:hyperlink w:history="1" r:id="rIdm2kvhju8kpfisogaoab7e">
         <w:r>
           <w:rPr>
             <w:rFonts w:ascii="Arial" w:cs="Arial" w:eastAsia="Arial" w:hAnsi="Arial"/>
@@ -1782,7 +1782,7 @@
       <w:pPr>
         <w:spacing w:after="60" w:before="0" w:line="288" w:lineRule="auto"/>
       </w:pPr>
-      <w:hyperlink w:history="1" r:id="rIdwymjhneki8bujt_rtlhez">
+      <w:hyperlink w:history="1" r:id="rIddlkjh8fj-hdiqbtqe20dq">
         <w:r>
           <w:rPr>
             <w:rFonts w:ascii="Arial" w:cs="Arial" w:eastAsia="Arial" w:hAnsi="Arial"/>
@@ -1799,7 +1799,7 @@
       <w:pPr>
         <w:spacing w:after="60" w:before="0" w:line="288" w:lineRule="auto"/>
       </w:pPr>
-      <w:hyperlink w:history="1" r:id="rIdzpotpa19cc5hyyp_d_qct">
+      <w:hyperlink w:history="1" r:id="rIdfe7zj5acc8jmq_aynqagp">
         <w:r>
           <w:rPr>
             <w:rFonts w:ascii="Arial" w:cs="Arial" w:eastAsia="Arial" w:hAnsi="Arial"/>
@@ -2730,7 +2730,7 @@
       <w:pPr>
         <w:spacing w:after="60" w:before="0" w:line="288" w:lineRule="auto"/>
       </w:pPr>
-      <w:hyperlink w:history="1" r:id="rIdgmenkbm8bxdv_a4f9k4t_">
+      <w:hyperlink w:history="1" r:id="rIdqlfwo5wwngrhpuovle_f5">
         <w:r>
           <w:rPr>
             <w:rFonts w:ascii="Arial" w:cs="Arial" w:eastAsia="Arial" w:hAnsi="Arial"/>
@@ -2747,7 +2747,7 @@
       <w:pPr>
         <w:spacing w:after="60" w:before="0" w:line="288" w:lineRule="auto"/>
       </w:pPr>
-      <w:hyperlink w:history="1" r:id="rIdrhb7gpd6r4veggvtwmmxu">
+      <w:hyperlink w:history="1" r:id="rIdlv1ihfegfabn-vrzjwmdg">
         <w:r>
           <w:rPr>
             <w:rFonts w:ascii="Arial" w:cs="Arial" w:eastAsia="Arial" w:hAnsi="Arial"/>
@@ -3710,7 +3710,7 @@
       <w:pPr>
         <w:spacing w:after="60" w:before="0" w:line="288" w:lineRule="auto"/>
       </w:pPr>
-      <w:hyperlink w:history="1" r:id="rId3p3rrvill7rlwijs9or86">
+      <w:hyperlink w:history="1" r:id="rId3lo8fx8eygyue1lq0l3mn">
         <w:r>
           <w:rPr>
             <w:rFonts w:ascii="Arial" w:cs="Arial" w:eastAsia="Arial" w:hAnsi="Arial"/>
@@ -3727,7 +3727,7 @@
       <w:pPr>
         <w:spacing w:after="60" w:before="0" w:line="288" w:lineRule="auto"/>
       </w:pPr>
-      <w:hyperlink w:history="1" r:id="rIdz_l5eign_qnqhwsekasqr">
+      <w:hyperlink w:history="1" r:id="rIdbxuy73axdlxagopvr2ole">
         <w:r>
           <w:rPr>
             <w:rFonts w:ascii="Arial" w:cs="Arial" w:eastAsia="Arial" w:hAnsi="Arial"/>
@@ -4674,7 +4674,7 @@
       <w:pPr>
         <w:spacing w:after="60" w:before="0" w:line="288" w:lineRule="auto"/>
       </w:pPr>
-      <w:hyperlink w:history="1" r:id="rId2jgg-cybplfpwq0jfuucu">
+      <w:hyperlink w:history="1" r:id="rId0attgl0mqpsg8kllyvkkp">
         <w:r>
           <w:rPr>
             <w:rFonts w:ascii="Arial" w:cs="Arial" w:eastAsia="Arial" w:hAnsi="Arial"/>
@@ -4691,7 +4691,7 @@
       <w:pPr>
         <w:spacing w:after="60" w:before="0" w:line="288" w:lineRule="auto"/>
       </w:pPr>
-      <w:hyperlink w:history="1" r:id="rIduxhzhbhwycyftkt4r-r-0">
+      <w:hyperlink w:history="1" r:id="rIdrflwtyjfskr0akttxdx7y">
         <w:r>
           <w:rPr>
             <w:rFonts w:ascii="Arial" w:cs="Arial" w:eastAsia="Arial" w:hAnsi="Arial"/>
@@ -5622,7 +5622,7 @@
       <w:pPr>
         <w:spacing w:after="60" w:before="0" w:line="288" w:lineRule="auto"/>
       </w:pPr>
-      <w:hyperlink w:history="1" r:id="rIdzirc9cytvtcpowzpfq_dn">
+      <w:hyperlink w:history="1" r:id="rIdp8wpplfzqepf7_0ox6rjr">
         <w:r>
           <w:rPr>
             <w:rFonts w:ascii="Arial" w:cs="Arial" w:eastAsia="Arial" w:hAnsi="Arial"/>
@@ -5639,7 +5639,7 @@
       <w:pPr>
         <w:spacing w:after="60" w:before="0" w:line="288" w:lineRule="auto"/>
       </w:pPr>
-      <w:hyperlink w:history="1" r:id="rId-co9lxq8joslwuenswtmg">
+      <w:hyperlink w:history="1" r:id="rIdzgac6z39vsqsrkpihifba">
         <w:r>
           <w:rPr>
             <w:rFonts w:ascii="Arial" w:cs="Arial" w:eastAsia="Arial" w:hAnsi="Arial"/>
@@ -5869,7 +5869,7 @@
           <w:sz w:val="21"/>
           <w:szCs w:val="21"/>
         </w:rPr>
-        <w:t xml:space="preserve">Create one named administrator account plus a sealed break-glass account. Course 1.9 moves device logins to central AAA through SBD-NPS01, and course 1.8 sends the router's syslog, including its deny log, to the collector; write both as dated follow-ups in the register now.</w:t>
+        <w:t xml:space="preserve">Give each administrator a named account on the router and keep one sealed break-glass account; shared logins hide who changed what. Course 1.8 sends the router's syslog, including its deny log, to the collector; write that as a dated follow-up in the register now.</w:t>
       </w:r>
     </w:p>
     <w:p>
@@ -6586,7 +6586,7 @@
       <w:pPr>
         <w:spacing w:after="60" w:before="0" w:line="288" w:lineRule="auto"/>
       </w:pPr>
-      <w:hyperlink w:history="1" r:id="rIduxpohoza68dd1ij7olox0">
+      <w:hyperlink w:history="1" r:id="rIdecn4s94jrykznkvmr9gux">
         <w:r>
           <w:rPr>
             <w:rFonts w:ascii="Arial" w:cs="Arial" w:eastAsia="Arial" w:hAnsi="Arial"/>
@@ -6603,7 +6603,7 @@
       <w:pPr>
         <w:spacing w:after="60" w:before="0" w:line="288" w:lineRule="auto"/>
       </w:pPr>
-      <w:hyperlink w:history="1" r:id="rIdeggswgvozkwoz-nsrw7fy">
+      <w:hyperlink w:history="1" r:id="rIdlh7zbfacxr7vomh6vm_p-">
         <w:r>
           <w:rPr>
             <w:rFonts w:ascii="Arial" w:cs="Arial" w:eastAsia="Arial" w:hAnsi="Arial"/>
@@ -7518,7 +7518,7 @@
       <w:pPr>
         <w:spacing w:after="60" w:before="0" w:line="288" w:lineRule="auto"/>
       </w:pPr>
-      <w:hyperlink w:history="1" r:id="rId3cejduprlguwaet6t6nw6">
+      <w:hyperlink w:history="1" r:id="rIdiwidi-ffqnygudua27lhg">
         <w:r>
           <w:rPr>
             <w:rFonts w:ascii="Arial" w:cs="Arial" w:eastAsia="Arial" w:hAnsi="Arial"/>

</xml_diff>

<commit_message>
Keep 802.1X on SBD-DHCP01; SBD-AUDIT01 is domain-joined Windows
- 802.1X port admission returns without a new server: the NPS role runs on
  SBD-DHCP01 (F20, IA-3), port admission only, so it stays Tier 1. Unknown
  devices land in quarantine VLAN 90. Course 1.9 regains the 802.1X lesson.
- SBD-AUDIT01 is Windows and domain-joined: domain paths, WSUS, and event
  forwarding now include it; course 1.8 provisions it that way.
- Workbooks, checklists, catalog counts, and generated files rebuilt.

Co-Authored-By: Claude Opus 5.5 <noreply@anthropic.com>
Claude-Session: https://claude.ai/code/session_019wopQQuPwG5CcFGYaGF73Y
</commit_message>
<xml_diff>
--- a/public/training/connect-segment/SecureByDesign-connect-segment-Workbook.docx
+++ b/public/training/connect-segment/SecureByDesign-connect-segment-Workbook.docx
@@ -1765,7 +1765,7 @@
       <w:pPr>
         <w:spacing w:after="60" w:before="0" w:line="288" w:lineRule="auto"/>
       </w:pPr>
-      <w:hyperlink w:history="1" r:id="rIdm2kvhju8kpfisogaoab7e">
+      <w:hyperlink w:history="1" r:id="rIdoxdtxrvdz3m3vjdgirxfu">
         <w:r>
           <w:rPr>
             <w:rFonts w:ascii="Arial" w:cs="Arial" w:eastAsia="Arial" w:hAnsi="Arial"/>
@@ -1782,7 +1782,7 @@
       <w:pPr>
         <w:spacing w:after="60" w:before="0" w:line="288" w:lineRule="auto"/>
       </w:pPr>
-      <w:hyperlink w:history="1" r:id="rIddlkjh8fj-hdiqbtqe20dq">
+      <w:hyperlink w:history="1" r:id="rIdn1vjnkae7pjhti0ucpd_b">
         <w:r>
           <w:rPr>
             <w:rFonts w:ascii="Arial" w:cs="Arial" w:eastAsia="Arial" w:hAnsi="Arial"/>
@@ -1799,7 +1799,7 @@
       <w:pPr>
         <w:spacing w:after="60" w:before="0" w:line="288" w:lineRule="auto"/>
       </w:pPr>
-      <w:hyperlink w:history="1" r:id="rIdfe7zj5acc8jmq_aynqagp">
+      <w:hyperlink w:history="1" r:id="rIdgm1mpjrcp7s6-kh9ixvzr">
         <w:r>
           <w:rPr>
             <w:rFonts w:ascii="Arial" w:cs="Arial" w:eastAsia="Arial" w:hAnsi="Arial"/>
@@ -2730,7 +2730,7 @@
       <w:pPr>
         <w:spacing w:after="60" w:before="0" w:line="288" w:lineRule="auto"/>
       </w:pPr>
-      <w:hyperlink w:history="1" r:id="rIdqlfwo5wwngrhpuovle_f5">
+      <w:hyperlink w:history="1" r:id="rId_hbim8eyh2poh-six3tsf">
         <w:r>
           <w:rPr>
             <w:rFonts w:ascii="Arial" w:cs="Arial" w:eastAsia="Arial" w:hAnsi="Arial"/>
@@ -2747,7 +2747,7 @@
       <w:pPr>
         <w:spacing w:after="60" w:before="0" w:line="288" w:lineRule="auto"/>
       </w:pPr>
-      <w:hyperlink w:history="1" r:id="rIdlv1ihfegfabn-vrzjwmdg">
+      <w:hyperlink w:history="1" r:id="rIdxdlezrfliludm2pmyzh2m">
         <w:r>
           <w:rPr>
             <w:rFonts w:ascii="Arial" w:cs="Arial" w:eastAsia="Arial" w:hAnsi="Arial"/>
@@ -3710,7 +3710,7 @@
       <w:pPr>
         <w:spacing w:after="60" w:before="0" w:line="288" w:lineRule="auto"/>
       </w:pPr>
-      <w:hyperlink w:history="1" r:id="rId3lo8fx8eygyue1lq0l3mn">
+      <w:hyperlink w:history="1" r:id="rId1unsbeiqiwbic417utuuk">
         <w:r>
           <w:rPr>
             <w:rFonts w:ascii="Arial" w:cs="Arial" w:eastAsia="Arial" w:hAnsi="Arial"/>
@@ -3727,7 +3727,7 @@
       <w:pPr>
         <w:spacing w:after="60" w:before="0" w:line="288" w:lineRule="auto"/>
       </w:pPr>
-      <w:hyperlink w:history="1" r:id="rIdbxuy73axdlxagopvr2ole">
+      <w:hyperlink w:history="1" r:id="rIdrdc3yggjp12k1eonddcrm">
         <w:r>
           <w:rPr>
             <w:rFonts w:ascii="Arial" w:cs="Arial" w:eastAsia="Arial" w:hAnsi="Arial"/>
@@ -4674,7 +4674,7 @@
       <w:pPr>
         <w:spacing w:after="60" w:before="0" w:line="288" w:lineRule="auto"/>
       </w:pPr>
-      <w:hyperlink w:history="1" r:id="rId0attgl0mqpsg8kllyvkkp">
+      <w:hyperlink w:history="1" r:id="rIdqberfgnqfuto2pxytw5n2">
         <w:r>
           <w:rPr>
             <w:rFonts w:ascii="Arial" w:cs="Arial" w:eastAsia="Arial" w:hAnsi="Arial"/>
@@ -4691,7 +4691,7 @@
       <w:pPr>
         <w:spacing w:after="60" w:before="0" w:line="288" w:lineRule="auto"/>
       </w:pPr>
-      <w:hyperlink w:history="1" r:id="rIdrflwtyjfskr0akttxdx7y">
+      <w:hyperlink w:history="1" r:id="rIddy9lmvqksg3byxwupyk0h">
         <w:r>
           <w:rPr>
             <w:rFonts w:ascii="Arial" w:cs="Arial" w:eastAsia="Arial" w:hAnsi="Arial"/>
@@ -5622,7 +5622,7 @@
       <w:pPr>
         <w:spacing w:after="60" w:before="0" w:line="288" w:lineRule="auto"/>
       </w:pPr>
-      <w:hyperlink w:history="1" r:id="rIdp8wpplfzqepf7_0ox6rjr">
+      <w:hyperlink w:history="1" r:id="rId0_hnwr2b795bc7air41g7">
         <w:r>
           <w:rPr>
             <w:rFonts w:ascii="Arial" w:cs="Arial" w:eastAsia="Arial" w:hAnsi="Arial"/>
@@ -5639,7 +5639,7 @@
       <w:pPr>
         <w:spacing w:after="60" w:before="0" w:line="288" w:lineRule="auto"/>
       </w:pPr>
-      <w:hyperlink w:history="1" r:id="rIdzgac6z39vsqsrkpihifba">
+      <w:hyperlink w:history="1" r:id="rIdrl3kap219wuyt2iev-jcz">
         <w:r>
           <w:rPr>
             <w:rFonts w:ascii="Arial" w:cs="Arial" w:eastAsia="Arial" w:hAnsi="Arial"/>
@@ -6586,7 +6586,7 @@
       <w:pPr>
         <w:spacing w:after="60" w:before="0" w:line="288" w:lineRule="auto"/>
       </w:pPr>
-      <w:hyperlink w:history="1" r:id="rIdecn4s94jrykznkvmr9gux">
+      <w:hyperlink w:history="1" r:id="rIdji7snr_-sywequprb90ob">
         <w:r>
           <w:rPr>
             <w:rFonts w:ascii="Arial" w:cs="Arial" w:eastAsia="Arial" w:hAnsi="Arial"/>
@@ -6603,7 +6603,7 @@
       <w:pPr>
         <w:spacing w:after="60" w:before="0" w:line="288" w:lineRule="auto"/>
       </w:pPr>
-      <w:hyperlink w:history="1" r:id="rIdlh7zbfacxr7vomh6vm_p-">
+      <w:hyperlink w:history="1" r:id="rId-mzlysqejoe7ymzzpcunu">
         <w:r>
           <w:rPr>
             <w:rFonts w:ascii="Arial" w:cs="Arial" w:eastAsia="Arial" w:hAnsi="Arial"/>
@@ -7518,7 +7518,7 @@
       <w:pPr>
         <w:spacing w:after="60" w:before="0" w:line="288" w:lineRule="auto"/>
       </w:pPr>
-      <w:hyperlink w:history="1" r:id="rIdiwidi-ffqnygudua27lhg">
+      <w:hyperlink w:history="1" r:id="rId4zenedleqp06ng9gs9j1r">
         <w:r>
           <w:rPr>
             <w:rFonts w:ascii="Arial" w:cs="Arial" w:eastAsia="Arial" w:hAnsi="Arial"/>

</xml_diff>